<commit_message>
Second review pass, export choices, and report update
- Review: all 2,366 hidden links on the top-300 topics judged (680 accepted);
  all 3,955 visible Maclaren machine links judged (3,109 kept, 846 rejected).
- Fix: decisions on entries that share a key are no longer skipped as duplicates.
- ai_review next: --top, --work and --visible options.
- Export: --translation KJV|ASV|BBE|WEB (default KJV), PDF copies of handouts
  and teacher's notes, 'Where Christians differ' on one slide and in the
  handout for all-views lessons; one-line view headlines in perspectives.tsv.
- Ratings count after 5 votes. All 44 lessons regenerated in KJV.
- REPORT.md, LESSONS.md, lessons/README.md and COUNTS.md updated.

Co-Authored-By: Claude Opus 5.5 <noreply@anthropic.com>
Claude-Session: https://claude.ai/code/session_012GRcBWdPw5e3Ch8ztZP4Qh
</commit_message>
<xml_diff>
--- a/lessons/output/baptism/baptism-handout.docx
+++ b/lessons/output/baptism/baptism-handout.docx
@@ -270,6 +270,79 @@
           <w:sz w:val="20"/>
         </w:rPr>
         <w:t>Read: Romans 6:4-11; 2 Corinthians 5:17; Colossians 3:1-3</w:t>
+      </w:r>
+    </w:p>
+    <w:p>
+      <w:pPr>
+        <w:pStyle w:val="Heading1"/>
+      </w:pPr>
+      <w:r>
+        <w:t>Where Christians differ</w:t>
+      </w:r>
+    </w:p>
+    <w:p>
+      <w:r>
+        <w:t>Christians agree that Jesus commanded baptism, that it is done with water in the name of the Father, Son and Holy Spirit, that it is linked with repentance, faith, forgiveness and union with Christ, and that true baptism is not repeated. They differ on three questions: who should be baptized (believers only, or also the children of believers), how (immersion, or also pouring and sprinkling), and what baptism does (a means through which God gives grace, a sign and seal of his covenant, or an act of obedience that testifies to grace already received). Here are the main views of the five traditions, each described as its own teachers describe it. Sincere, Bible-believing Christians hold each of them.</w:t>
+      </w:r>
+    </w:p>
+    <w:p>
+      <w:r>
+        <w:rPr>
+          <w:b/>
+          <w:i w:val="0"/>
+        </w:rPr>
+        <w:t xml:space="preserve">Baptist. </w:t>
+      </w:r>
+      <w:r>
+        <w:t>Baptists teach "believer's baptism": baptism is for those who have personally repented and put their faith in Christ, and it is done by immersing the whole body in water, picturing death, burial and resurrection with Christ. Baptism is an ordinance of obedience and a public confession of faith; it does not itself save or convey grace, but follows salvation. Because infants cannot yet believe, they are not baptized; many Baptist churches hold a service of dedication instead, and a person baptized as an infant is baptized as a believer.</w:t>
+      </w:r>
+    </w:p>
+    <w:p>
+      <w:r>
+        <w:rPr>
+          <w:b/>
+          <w:i w:val="0"/>
+        </w:rPr>
+        <w:t xml:space="preserve">Methodist and Wesleyan. </w:t>
+      </w:r>
+      <w:r>
+        <w:t>Methodists and Wesleyans treat baptism as a sacrament: an outward sign of an inward grace and a means by which God works. It marks entry into the church and God's covenant, and it is given both to adults who come to faith and to the infants of Christian families. Pouring or sprinkling is usual, though immersion is also accepted. John Wesley linked baptism with the new birth, but taught that every baptized person must still personally turn to Christ and be born of the Spirit; baptized children are later confirmed in their own profession of faith.</w:t>
+      </w:r>
+    </w:p>
+    <w:p>
+      <w:r>
+        <w:rPr>
+          <w:b/>
+          <w:i w:val="0"/>
+        </w:rPr>
+        <w:t xml:space="preserve">Presbyterian and Reformed. </w:t>
+      </w:r>
+      <w:r>
+        <w:t>Presbyterian and Reformed churches teach that baptism is a sacrament, a sign and seal of God's covenant of grace, which in the New Testament takes the place of circumcision. It is given to those who profess faith and also to the children of believing parents, because God's covenant promise is "unto you, and to your children" (Acts 2:39). Sprinkling or pouring is usual and immersion is valid. The grace signified is not tied to the moment of baptism and is received by faith; baptism does not automatically regenerate, and it is administered only once.</w:t>
+      </w:r>
+    </w:p>
+    <w:p>
+      <w:r>
+        <w:rPr>
+          <w:b/>
+          <w:i w:val="0"/>
+        </w:rPr>
+        <w:t xml:space="preserve">Lutheran. </w:t>
+      </w:r>
+      <w:r>
+        <w:t>Lutherans teach that baptism is a means of grace: not simply water, but water joined to God's command and promise. Through it God gives forgiveness of sins, rescue from death and the devil, and eternal salvation to all who believe. Faith receives the gift, and God works faith even in infants through his Word, so children are baptized. The Augsburg Confession calls baptism necessary to salvation (while Lutherans do not teach that the unbaptized who believe are lost). Pouring is the usual mode. The baptized person returns daily to baptism by repentance and faith.</w:t>
+      </w:r>
+    </w:p>
+    <w:p>
+      <w:r>
+        <w:rPr>
+          <w:b/>
+          <w:i w:val="0"/>
+        </w:rPr>
+        <w:t xml:space="preserve">Pentecostal and Charismatic. </w:t>
+      </w:r>
+      <w:r>
+        <w:t>Most Pentecostal churches (for example the Assemblies of God and the Foursquare Church) practise believer's baptism by immersion, much as Baptists do: an act of obedience and public testimony by those who have been born again, not a means of salvation. Infants are dedicated, not baptized. Pentecostals give special emphasis to a second, distinct "baptism in the Holy Spirit" (see the lesson on spiritual gifts). A minority ("Oneness" Pentecostals) baptize in the name of Jesus only; most Pentecostals use the threefold name of Father, Son and Holy Spirit.</w:t>
       </w:r>
     </w:p>
     <w:p>

</xml_diff>